<commit_message>
fix: estabilizar conversion y render de plantillas Job-up
</commit_message>
<xml_diff>
--- a/boveda-entrevista-profesional/busqueda-empleo/proceso/plantillas/TEMPLATE_CARTA_PRESENTACION_FORMATO.docx
+++ b/boveda-entrevista-profesional/busqueda-empleo/proceso/plantillas/TEMPLATE_CARTA_PRESENTACION_FORMATO.docx
@@ -130,7 +130,7 @@
     </w:tbl>
     <w:p>
       <w:pPr>
-        <w:spacing w:before="100" w:after="40"/>
+        <w:spacing w:before="100" w:after="40" w:line="240" w:lineRule="auto"/>
         <w:jc w:val="left"/>
       </w:pPr>
       <w:r>
@@ -145,12 +145,6 @@
     </w:p>
     <w:p>
       <w:pPr>
-        <w:spacing w:before="0" w:after="0" w:line="96" w:lineRule="auto"/>
-        <w:jc w:val="left"/>
-      </w:pPr>
-    </w:p>
-    <w:p>
-      <w:pPr>
         <w:spacing w:before="0" w:after="40" w:line="240" w:lineRule="auto"/>
         <w:jc w:val="left"/>
       </w:pPr>
@@ -158,7 +152,6 @@
         <w:rPr>
           <w:rFonts w:ascii="Calibri" w:hAnsi="Calibri" w:eastAsia="Calibri"/>
           <w:b w:val="0"/>
-          <w:i w:val="0"/>
           <w:color w:val="5B6573"/>
           <w:sz w:val="21"/>
         </w:rPr>
@@ -174,7 +167,6 @@
         <w:rPr>
           <w:rFonts w:ascii="Calibri" w:hAnsi="Calibri" w:eastAsia="Calibri"/>
           <w:b w:val="0"/>
-          <w:i w:val="0"/>
           <w:color w:val="5B6573"/>
           <w:sz w:val="21"/>
         </w:rPr>
@@ -190,7 +182,6 @@
         <w:rPr>
           <w:rFonts w:ascii="Calibri" w:hAnsi="Calibri" w:eastAsia="Calibri"/>
           <w:b/>
-          <w:i w:val="0"/>
           <w:color w:val="1F2937"/>
           <w:sz w:val="24"/>
         </w:rPr>
@@ -206,7 +197,6 @@
         <w:rPr>
           <w:rFonts w:ascii="Calibri" w:hAnsi="Calibri" w:eastAsia="Calibri"/>
           <w:b w:val="0"/>
-          <w:i w:val="0"/>
           <w:color w:val="1F2937"/>
           <w:sz w:val="22"/>
         </w:rPr>
@@ -222,7 +212,6 @@
         <w:rPr>
           <w:rFonts w:ascii="Calibri" w:hAnsi="Calibri" w:eastAsia="Calibri"/>
           <w:b w:val="0"/>
-          <w:i w:val="0"/>
           <w:color w:val="1F2937"/>
           <w:sz w:val="22"/>
         </w:rPr>
@@ -238,7 +227,6 @@
         <w:rPr>
           <w:rFonts w:ascii="Calibri" w:hAnsi="Calibri" w:eastAsia="Calibri"/>
           <w:b w:val="0"/>
-          <w:i w:val="0"/>
           <w:color w:val="1F2937"/>
           <w:sz w:val="22"/>
         </w:rPr>
@@ -254,7 +242,6 @@
         <w:rPr>
           <w:rFonts w:ascii="Calibri" w:hAnsi="Calibri" w:eastAsia="Calibri"/>
           <w:b w:val="0"/>
-          <w:i w:val="0"/>
           <w:color w:val="1F2937"/>
           <w:sz w:val="22"/>
         </w:rPr>
@@ -270,7 +257,6 @@
         <w:rPr>
           <w:rFonts w:ascii="Calibri" w:hAnsi="Calibri" w:eastAsia="Calibri"/>
           <w:b w:val="0"/>
-          <w:i w:val="0"/>
           <w:color w:val="1F2937"/>
           <w:sz w:val="22"/>
         </w:rPr>
@@ -286,7 +272,6 @@
         <w:rPr>
           <w:rFonts w:ascii="Calibri" w:hAnsi="Calibri" w:eastAsia="Calibri"/>
           <w:b w:val="0"/>
-          <w:i w:val="0"/>
           <w:color w:val="1F2937"/>
           <w:sz w:val="22"/>
         </w:rPr>
@@ -302,7 +287,6 @@
         <w:rPr>
           <w:rFonts w:ascii="Calibri" w:hAnsi="Calibri" w:eastAsia="Calibri"/>
           <w:b w:val="0"/>
-          <w:i w:val="0"/>
           <w:color w:val="1F2937"/>
           <w:sz w:val="22"/>
         </w:rPr>
@@ -318,7 +302,6 @@
         <w:rPr>
           <w:rFonts w:ascii="Calibri" w:hAnsi="Calibri" w:eastAsia="Calibri"/>
           <w:b w:val="0"/>
-          <w:i w:val="0"/>
           <w:color w:val="1F2937"/>
           <w:sz w:val="22"/>
         </w:rPr>
@@ -340,7 +323,6 @@
 <w:ftr xmlns:m="http://schemas.openxmlformats.org/officeDocument/2006/math" xmlns:mc="http://schemas.openxmlformats.org/markup-compatibility/2006" xmlns:mo="http://schemas.microsoft.com/office/mac/office/2008/main" xmlns:mv="urn:schemas-microsoft-com:mac:vml" xmlns:o="urn:schemas-microsoft-com:office:office" xmlns:r="http://schemas.openxmlformats.org/officeDocument/2006/relationships" xmlns:v="urn:schemas-microsoft-com:vml" xmlns:w10="urn:schemas-microsoft-com:office:word" xmlns:w14="http://schemas.microsoft.com/office/word/2010/wordml" xmlns:w="http://schemas.openxmlformats.org/wordprocessingml/2006/main" xmlns:wne="http://schemas.microsoft.com/office/word/2006/wordml" xmlns:wp14="http://schemas.microsoft.com/office/word/2010/wordprocessingDrawing" xmlns:wp="http://schemas.openxmlformats.org/drawingml/2006/wordprocessingDrawing" xmlns:wpc="http://schemas.microsoft.com/office/word/2010/wordprocessingCanvas" xmlns:wpg="http://schemas.microsoft.com/office/word/2010/wordprocessingGroup" xmlns:wpi="http://schemas.microsoft.com/office/word/2010/wordprocessingInk" xmlns:wps="http://schemas.microsoft.com/office/word/2010/wordprocessingShape" mc:Ignorable="w14 wp14">
   <w:p>
     <w:pPr>
-      <w:pStyle w:val="Footer"/>
       <w:spacing w:before="0" w:after="0" w:line="240" w:lineRule="auto"/>
       <w:jc w:val="center"/>
     </w:pPr>
@@ -348,7 +330,6 @@
       <w:rPr>
         <w:rFonts w:ascii="Calibri" w:hAnsi="Calibri" w:eastAsia="Calibri"/>
         <w:b w:val="0"/>
-        <w:i w:val="0"/>
         <w:color w:val="5B6573"/>
         <w:sz w:val="18"/>
       </w:rPr>

</xml_diff>

<commit_message>
Implementa generador documental de candidaturas
</commit_message>
<xml_diff>
--- a/boveda-entrevista-profesional/busqueda-empleo/proceso/plantillas/TEMPLATE_CARTA_PRESENTACION_FORMATO.docx
+++ b/boveda-entrevista-profesional/busqueda-empleo/proceso/plantillas/TEMPLATE_CARTA_PRESENTACION_FORMATO.docx
@@ -17,14 +17,14 @@
         <w:tblLook w:val="04a0" w:firstRow="1" w:noVBand="1" w:lastRow="0" w:firstColumn="1" w:lastColumn="0" w:noHBand="0"/>
       </w:tblPr>
       <w:tblGrid>
-        <w:gridCol w:w="8278"/>
-        <w:gridCol w:w="1802"/>
+        <w:gridCol w:w="8277"/>
+        <w:gridCol w:w="1803"/>
       </w:tblGrid>
       <w:tr>
         <w:trPr/>
         <w:tc>
           <w:tcPr>
-            <w:tcW w:w="8278" w:type="dxa"/>
+            <w:tcW w:w="8277" w:type="dxa"/>
             <w:tcBorders/>
             <w:vAlign w:val="center"/>
           </w:tcPr>
@@ -51,7 +51,9 @@
               <w:pStyle w:val="Normal"/>
               <w:spacing w:lineRule="auto" w:line="240" w:before="0" w:after="40"/>
               <w:jc w:val="start"/>
-              <w:rPr/>
+              <w:rPr>
+                <w:sz w:val="24"/>
+              </w:rPr>
             </w:pPr>
             <w:r>
               <w:rPr>
@@ -59,7 +61,7 @@
                 <w:b w:val="false"/>
                 <w:i w:val="false"/>
                 <w:color w:val="5B6573"/>
-                <w:sz w:val="22"/>
+                <w:sz w:val="24"/>
               </w:rPr>
               <w:t>[TITULAR]</w:t>
             </w:r>
@@ -69,7 +71,9 @@
               <w:pStyle w:val="Normal"/>
               <w:spacing w:lineRule="auto" w:line="240" w:before="0" w:after="0"/>
               <w:jc w:val="start"/>
-              <w:rPr/>
+              <w:rPr>
+                <w:sz w:val="20"/>
+              </w:rPr>
             </w:pPr>
             <w:r>
               <w:rPr>
@@ -77,7 +81,7 @@
                 <w:b w:val="false"/>
                 <w:i w:val="false"/>
                 <w:color w:val="5B6573"/>
-                <w:sz w:val="21"/>
+                <w:sz w:val="20"/>
               </w:rPr>
               <w:t>[EMAIL] | [TELÉFONO] | [LINKEDIN]</w:t>
             </w:r>
@@ -85,7 +89,7 @@
         </w:tc>
         <w:tc>
           <w:tcPr>
-            <w:tcW w:w="1802" w:type="dxa"/>
+            <w:tcW w:w="1803" w:type="dxa"/>
             <w:tcBorders/>
             <w:vAlign w:val="center"/>
           </w:tcPr>
@@ -383,7 +387,12 @@
       </w:rPr>
     </w:pPr>
     <w:r>
-      <w:rPr/>
+      <w:rPr>
+        <w:rFonts w:eastAsia="Calibri"/>
+        <w:b w:val="false"/>
+        <w:color w:val="5B6573"/>
+        <w:sz w:val="18"/>
+      </w:rPr>
     </w:r>
   </w:p>
 </w:ftr>
@@ -404,7 +413,12 @@
       </w:rPr>
     </w:pPr>
     <w:r>
-      <w:rPr/>
+      <w:rPr>
+        <w:rFonts w:eastAsia="Calibri"/>
+        <w:b w:val="false"/>
+        <w:color w:val="5B6573"/>
+        <w:sz w:val="18"/>
+      </w:rPr>
     </w:r>
   </w:p>
 </w:ftr>
@@ -2103,15 +2117,15 @@
       <w:rFonts w:cs="Lucida Sans"/>
     </w:rPr>
   </w:style>
-  <w:style w:type="paragraph" w:styleId="Cabeceraypieuser">
-    <w:name w:val="Cabecera y pie (user)"/>
+  <w:style w:type="paragraph" w:styleId="Cabeceraypie">
+    <w:name w:val="Cabecera y pie"/>
     <w:basedOn w:val="Normal"/>
     <w:qFormat/>
     <w:pPr/>
     <w:rPr/>
   </w:style>
-  <w:style w:type="paragraph" w:styleId="Cabeceraypie">
-    <w:name w:val="Cabecera y pie"/>
+  <w:style w:type="paragraph" w:styleId="Cabeceraypieuser">
+    <w:name w:val="Cabecera y pie (user)"/>
     <w:basedOn w:val="Normal"/>
     <w:qFormat/>
     <w:pPr/>
@@ -2493,7 +2507,7 @@
   </w:style>
   <w:style w:type="paragraph" w:styleId="IndexHeading">
     <w:name w:val="index heading"/>
-    <w:basedOn w:val="Ttulouser"/>
+    <w:basedOn w:val="Ttulo"/>
     <w:pPr/>
     <w:rPr/>
   </w:style>
@@ -2511,8 +2525,8 @@
     </w:pPr>
     <w:rPr/>
   </w:style>
-  <w:style w:type="numbering" w:styleId="Ningunalistauser" w:default="1">
-    <w:name w:val="Ninguna lista (user)"/>
+  <w:style w:type="numbering" w:styleId="Ningunalista" w:default="1">
+    <w:name w:val="Ninguna lista"/>
     <w:uiPriority w:val="99"/>
     <w:semiHidden/>
     <w:unhideWhenUsed/>

</xml_diff>